<commit_message>
docs: upload all report documents and presentation slides
</commit_message>
<xml_diff>
--- a/Tai_lieu/Chương/Chốt/Chuong_1.docx
+++ b/Tai_lieu/Chương/Chốt/Chuong_1.docx
@@ -2782,19 +2782,23 @@
     </w:p>
     <w:p>
       <w:pPr>
-        <w:spacing w:line="276" w:lineRule="auto"/>
+        <w:rPr>
+          <w:lang w:val="en-US"/>
+        </w:rPr>
       </w:pPr>
       <w:r>
-        <w:t>Tác nhân nghiệp vụ chính là Người dùng. Hệ điều hành Android hỗ trợ phát báo thức và thông báo, không đóng vai trò người sử dụng dữ liệu sức khỏe. Bảng 1.1 tổng hợp các ca sử dụng; Hình 1.1 biểu diễn các nhóm tương tác giữa người dùng và Vita. Ngoại trừ đăng ký và đăng nhập, các chức năng nghiệp vụ yêu cầu phiên đăng nhập hợp lệ.</w:t>
+        <w:rPr>
+          <w:lang w:val="en-US"/>
+        </w:rPr>
+        <w:t>Tác nhân nghiệp vụ chính là Người dùng. Hệ điều hành Android hỗ trợ báo thức và thông báo. Bảng 1.1 mô tả 13 ca sử dụng của ứng dụng; Hình 1.1 biểu diễn tương ứng từng ca sử dụng từ UC01 đến UC13 và mối liên hệ với tác nhân Người dùng. Ngoại trừ đăng ký và đăng nhập, các chức năng nghiệp vụ yêu cầu phiên đăng nhập hợp lệ.</w:t>
       </w:r>
     </w:p>
     <w:p>
       <w:pPr>
-        <w:spacing w:line="276" w:lineRule="auto"/>
-      </w:pPr>
-      <w:r>
-        <w:br w:type="page"/>
-      </w:r>
+        <w:rPr>
+          <w:lang w:val="en-US"/>
+        </w:rPr>
+      </w:pPr>
     </w:p>
     <w:p>
       <w:pPr>
@@ -2802,8 +2806,16 @@
         <w:spacing w:line="276" w:lineRule="auto"/>
       </w:pPr>
       <w:r>
-        <w:lastRenderedPageBreak/>
-        <w:t>Các ca sử dụng của ứng dụng Vita</w:t>
+        <w:t xml:space="preserve">Các </w:t>
+      </w:r>
+      <w:r>
+        <w:rPr>
+          <w:lang w:val="en-US"/>
+        </w:rPr>
+        <w:t>UC</w:t>
+      </w:r>
+      <w:r>
+        <w:t xml:space="preserve"> sử dụng của ứng dụng Vita</w:t>
       </w:r>
     </w:p>
     <w:tbl>
@@ -3253,6 +3265,7 @@
                 <w:rFonts w:ascii="Times New Roman" w:hAnsi="Times New Roman"/>
                 <w:sz w:val="24"/>
               </w:rPr>
+              <w:lastRenderedPageBreak/>
               <w:t>UC04</w:t>
             </w:r>
           </w:p>
@@ -4253,10 +4266,10 @@
         </w:rPr>
         <w:lastRenderedPageBreak/>
         <w:drawing>
-          <wp:inline distT="0" distB="0" distL="0" distR="0" wp14:anchorId="4DDE7351" wp14:editId="69FAD3D9">
-            <wp:extent cx="5760000" cy="5632000"/>
-            <wp:effectExtent l="0" t="0" r="0" b="0"/>
-            <wp:docPr id="4" name="Picture 4"/>
+          <wp:inline distT="0" distB="0" distL="0" distR="0" wp14:anchorId="3EFE7776" wp14:editId="3D625798">
+            <wp:extent cx="5760085" cy="6400165"/>
+            <wp:effectExtent l="0" t="0" r="0" b="635"/>
+            <wp:docPr id="5" name="Picture 5" descr="Sơ đồ 13 UC Vita"/>
             <wp:cNvGraphicFramePr>
               <a:graphicFrameLocks xmlns:a="http://schemas.openxmlformats.org/drawingml/2006/main" noChangeAspect="1"/>
             </wp:cNvGraphicFramePr>
@@ -4264,23 +4277,36 @@
               <a:graphicData uri="http://schemas.openxmlformats.org/drawingml/2006/picture">
                 <pic:pic xmlns:pic="http://schemas.openxmlformats.org/drawingml/2006/picture">
                   <pic:nvPicPr>
-                    <pic:cNvPr id="0" name="usecase.png"/>
-                    <pic:cNvPicPr/>
+                    <pic:cNvPr id="0" name="Picture 8" descr="Sơ đồ 13 UC Vita"/>
+                    <pic:cNvPicPr>
+                      <a:picLocks noChangeAspect="1" noChangeArrowheads="1"/>
+                    </pic:cNvPicPr>
                   </pic:nvPicPr>
                   <pic:blipFill>
-                    <a:blip r:embed="rId9"/>
+                    <a:blip r:embed="rId9" cstate="print">
+                      <a:extLst>
+                        <a:ext uri="{28A0092B-C50C-407E-A947-70E740481C1C}">
+                          <a14:useLocalDpi xmlns:a14="http://schemas.microsoft.com/office/drawing/2010/main" val="0"/>
+                        </a:ext>
+                      </a:extLst>
+                    </a:blip>
+                    <a:srcRect/>
                     <a:stretch>
                       <a:fillRect/>
                     </a:stretch>
                   </pic:blipFill>
-                  <pic:spPr>
+                  <pic:spPr bwMode="auto">
                     <a:xfrm>
                       <a:off x="0" y="0"/>
-                      <a:ext cx="5760000" cy="5632000"/>
+                      <a:ext cx="5760085" cy="6400165"/>
                     </a:xfrm>
                     <a:prstGeom prst="rect">
                       <a:avLst/>
                     </a:prstGeom>
+                    <a:noFill/>
+                    <a:ln>
+                      <a:noFill/>
+                    </a:ln>
                   </pic:spPr>
                 </pic:pic>
               </a:graphicData>
@@ -4295,24 +4321,58 @@
         <w:spacing w:line="276" w:lineRule="auto"/>
       </w:pPr>
       <w:r>
-        <w:t>Sơ đồ ca sử dụng tổng quát của ứng dụng Vita</w:t>
+        <w:t xml:space="preserve">Sơ đồ </w:t>
       </w:r>
-    </w:p>
-    <w:p>
-      <w:pPr>
-        <w:spacing w:line="276" w:lineRule="auto"/>
-      </w:pPr>
       <w:r>
-        <w:t>Sơ đồ gộp các thao tác thêm, sửa, xóa và xem lịch sử vào nhóm chức năng tương ứng để dễ đọc. Đăng nhập hợp lệ là tiền điều kiện chung của các nhóm nghiệp vụ, vì vậy không vẽ quan hệ bao gồm từ mọi chức năng đến Đăng nhập. Chi tiết các thao tác được trình bày tại Bảng 1.1.</w:t>
+        <w:rPr>
+          <w:lang w:val="en-US"/>
+        </w:rPr>
+        <w:t>UC</w:t>
       </w:r>
-    </w:p>
-    <w:p>
-      <w:pPr>
-        <w:spacing w:line="276" w:lineRule="auto"/>
-      </w:pPr>
       <w:r>
-        <w:br w:type="page"/>
+        <w:t xml:space="preserve"> sử dụng tổng quát của ứng dụng Vita</w:t>
       </w:r>
+    </w:p>
+    <w:p>
+      <w:pPr>
+        <w:rPr>
+          <w:lang w:val="en-US"/>
+        </w:rPr>
+      </w:pPr>
+      <w:r>
+        <w:rPr>
+          <w:lang w:val="en-US"/>
+        </w:rPr>
+        <w:t>Sơ đồ thể hiện riêng 13 ca sử dụng, tương ứng với các mã và tên trong Bảng 1.1. Mỗi đường liên kết biểu diễn sự tương tác giữa Người dùng và một ca sử dụng. Đăng nhập hợp lệ là tiền điều kiện của UC03 đến UC13, vì vậy không biểu diễn quan hệ «include» từ các ca sử dụng này đến Đăng nhập. Các thao tác và kết quả chính của từng ca sử dụng được mô tả trong Bảng 1.1.</w:t>
+      </w:r>
+    </w:p>
+    <w:p>
+      <w:pPr>
+        <w:rPr>
+          <w:lang w:val="en-US"/>
+        </w:rPr>
+      </w:pPr>
+    </w:p>
+    <w:p>
+      <w:pPr>
+        <w:rPr>
+          <w:lang w:val="en-US"/>
+        </w:rPr>
+      </w:pPr>
+    </w:p>
+    <w:p>
+      <w:pPr>
+        <w:rPr>
+          <w:lang w:val="en-US"/>
+        </w:rPr>
+      </w:pPr>
+    </w:p>
+    <w:p>
+      <w:pPr>
+        <w:rPr>
+          <w:lang w:val="en-US"/>
+        </w:rPr>
+      </w:pPr>
     </w:p>
     <w:p>
       <w:pPr>
@@ -5605,14 +5665,15 @@
       </w:pPr>
       <w:r>
         <w:rPr>
+          <w:noProof/>
           <w:lang w:val="en-US"/>
         </w:rPr>
         <w:lastRenderedPageBreak/>
         <w:drawing>
-          <wp:inline distT="0" distB="0" distL="0" distR="0" wp14:anchorId="6CDEE21A" wp14:editId="5064E860">
+          <wp:inline distT="0" distB="0" distL="0" distR="0" wp14:anchorId="2A30DE30" wp14:editId="6CE6308C">
             <wp:extent cx="5760085" cy="5469890"/>
             <wp:effectExtent l="0" t="0" r="0" b="0"/>
-            <wp:docPr id="7" name="Picture 7"/>
+            <wp:docPr id="3" name="Picture 3"/>
             <wp:cNvGraphicFramePr>
               <a:graphicFrameLocks xmlns:a="http://schemas.openxmlformats.org/drawingml/2006/main" noChangeAspect="1"/>
             </wp:cNvGraphicFramePr>
@@ -5729,6 +5790,7 @@
       </w:pPr>
       <w:r>
         <w:rPr>
+          <w:noProof/>
           <w:lang w:val="en-US"/>
         </w:rPr>
         <w:drawing>
@@ -18636,6 +18698,7 @@
   <w:style w:type="character" w:default="1" w:styleId="DefaultParagraphFont">
     <w:name w:val="Default Paragraph Font"/>
     <w:uiPriority w:val="1"/>
+    <w:semiHidden/>
     <w:unhideWhenUsed/>
   </w:style>
   <w:style w:type="table" w:default="1" w:styleId="TableNormal">

</xml_diff>

<commit_message>
docs: update finalized chapter one report
</commit_message>
<xml_diff>
--- a/Tai_lieu/Chương/Chốt/Chuong_1.docx
+++ b/Tai_lieu/Chương/Chốt/Chuong_1.docx
@@ -4235,7 +4235,16 @@
         <w:spacing w:line="276" w:lineRule="auto"/>
       </w:pPr>
       <w:r>
-        <w:t>Trong ca sử dụng Quản lý lần đo, hệ thống phải kiểm tra nội dung trước khi lưu và chỉ cho phép thao tác trên bản ghi thuộc tài khoản hiện tại. Khi xóa bản ghi hoặc thuốc, ứng dụng hiển thị xác nhận để người dùng nhận biết tác động. Riêng xóa tài khoản yêu cầu nhập lại mật khẩu do phạm vi dữ liệu bị xóa lớn hơn.</w:t>
+        <w:t xml:space="preserve">Trong </w:t>
+      </w:r>
+      <w:r>
+        <w:rPr>
+          <w:lang w:val="en-US"/>
+        </w:rPr>
+        <w:t>UC</w:t>
+      </w:r>
+      <w:r>
+        <w:t xml:space="preserve"> sử dụng Quản lý lần đo, hệ thống phải kiểm tra nội dung trước khi lưu và chỉ cho phép thao tác trên bản ghi thuộc tài khoản hiện tại. Khi xóa bản ghi hoặc thuốc, ứng dụng hiển thị xác nhận để người dùng nhận biết tác động. Riêng xóa tài khoản yêu cầu nhập lại mật khẩu do phạm vi dữ liệu bị xóa lớn hơn.</w:t>
       </w:r>
     </w:p>
     <w:p>
@@ -4343,7 +4352,55 @@
         <w:rPr>
           <w:lang w:val="en-US"/>
         </w:rPr>
-        <w:t>Sơ đồ thể hiện riêng 13 ca sử dụng, tương ứng với các mã và tên trong Bảng 1.1. Mỗi đường liên kết biểu diễn sự tương tác giữa Người dùng và một ca sử dụng. Đăng nhập hợp lệ là tiền điều kiện của UC03 đến UC13, vì vậy không biểu diễn quan hệ «include» từ các ca sử dụng này đến Đăng nhập. Các thao tác và kết quả chính của từng ca sử dụng được mô tả trong Bảng 1.1.</w:t>
+        <w:t xml:space="preserve">Sơ đồ thể hiện riêng 13 </w:t>
+      </w:r>
+      <w:r>
+        <w:rPr>
+          <w:lang w:val="en-US"/>
+        </w:rPr>
+        <w:t>UC</w:t>
+      </w:r>
+      <w:r>
+        <w:rPr>
+          <w:lang w:val="en-US"/>
+        </w:rPr>
+        <w:t xml:space="preserve"> sử dụng, tương ứng với các mã và tên trong Bảng 1.1. Mỗi đường liên kết biểu diễn sự tương tác giữa Người dùng và một </w:t>
+      </w:r>
+      <w:r>
+        <w:rPr>
+          <w:lang w:val="en-US"/>
+        </w:rPr>
+        <w:t>UC</w:t>
+      </w:r>
+      <w:r>
+        <w:rPr>
+          <w:lang w:val="en-US"/>
+        </w:rPr>
+        <w:t xml:space="preserve"> sử dụng. Đăng nhập hợp lệ là tiền điều kiện của UC03 đến UC13, vì vậy không biểu diễn quan hệ «include» từ các</w:t>
+      </w:r>
+      <w:r>
+        <w:rPr>
+          <w:lang w:val="en-US"/>
+        </w:rPr>
+        <w:t xml:space="preserve"> UC </w:t>
+      </w:r>
+      <w:r>
+        <w:rPr>
+          <w:lang w:val="en-US"/>
+        </w:rPr>
+        <w:t xml:space="preserve">sử dụng này đến Đăng nhập. Các thao tác và kết quả chính của từng </w:t>
+      </w:r>
+      <w:r>
+        <w:rPr>
+          <w:lang w:val="en-US"/>
+        </w:rPr>
+        <w:t xml:space="preserve">UC </w:t>
+      </w:r>
+      <w:r>
+        <w:rPr>
+          <w:lang w:val="en-US"/>
+        </w:rPr>
+        <w:t>sử dụng được mô tả trong Bảng 1.1.</w:t>
       </w:r>
     </w:p>
     <w:p>

</xml_diff>